<commit_message>
mudei a tabela 5 que o professor felipe pediu
</commit_message>
<xml_diff>
--- a/AnaliseRequesitos/FranciscoMartins_2025115671/Roles e Requisitos do SI Veterinário.docx
+++ b/AnaliseRequesitos/FranciscoMartins_2025115671/Roles e Requisitos do SI Veterinário.docx
@@ -341,7 +341,19 @@
               <w:rPr>
                 <w:lang w:val="pt-PT"/>
               </w:rPr>
-              <w:t>Prestador de serviço. Cria/edita o perfil, define disponibilidade, consulta/aceita/rejeita pedidos, gere reservas e consulta avaliações recebidas.</w:t>
+              <w:t>Utilizador autenticado</w:t>
+            </w:r>
+            <w:r>
+              <w:rPr>
+                <w:lang w:val="pt-PT"/>
+              </w:rPr>
+              <w:t>, sendo p</w:t>
+            </w:r>
+            <w:r>
+              <w:rPr>
+                <w:lang w:val="pt-PT"/>
+              </w:rPr>
+              <w:t>restador de serviço. Cria/edita o perfil, define disponibilidade, consulta/aceita/rejeita pedidos, gere reservas e consulta avaliações recebidas.</w:t>
             </w:r>
           </w:p>
         </w:tc>
@@ -417,13 +429,29 @@
                 <w:lang w:val="pt-PT"/>
               </w:rPr>
             </w:pPr>
-            <w:proofErr w:type="spellStart"/>
-            <w:r>
-              <w:t>Pessoas</w:t>
-            </w:r>
-            <w:proofErr w:type="spellEnd"/>
-            <w:r>
-              <w:t xml:space="preserve"> </w:t>
+            <w:r>
+              <w:rPr>
+                <w:lang w:val="pt-PT"/>
+              </w:rPr>
+              <w:t>Utilizador</w:t>
+            </w:r>
+            <w:r>
+              <w:rPr>
+                <w:lang w:val="pt-PT"/>
+              </w:rPr>
+              <w:t>es</w:t>
+            </w:r>
+            <w:r>
+              <w:rPr>
+                <w:lang w:val="pt-PT"/>
+              </w:rPr>
+              <w:t xml:space="preserve"> autenticado</w:t>
+            </w:r>
+            <w:r>
+              <w:rPr>
+                <w:lang w:val="pt-PT"/>
+              </w:rPr>
+              <w:t xml:space="preserve">s, </w:t>
             </w:r>
             <w:proofErr w:type="spellStart"/>
             <w:r>
@@ -668,7 +696,31 @@
               <w:rPr>
                 <w:lang w:val="pt-PT"/>
               </w:rPr>
-              <w:t>Utilizador que auxilia em tarefas operacionais (</w:t>
+              <w:t>Utilizador</w:t>
+            </w:r>
+            <w:r>
+              <w:rPr>
+                <w:lang w:val="pt-PT"/>
+              </w:rPr>
+              <w:t xml:space="preserve"> </w:t>
+            </w:r>
+            <w:r>
+              <w:rPr>
+                <w:lang w:val="pt-PT"/>
+              </w:rPr>
+              <w:t>autenticado</w:t>
+            </w:r>
+            <w:r>
+              <w:rPr>
+                <w:lang w:val="pt-PT"/>
+              </w:rPr>
+              <w:t>,</w:t>
+            </w:r>
+            <w:r>
+              <w:rPr>
+                <w:lang w:val="pt-PT"/>
+              </w:rPr>
+              <w:t xml:space="preserve"> que auxilia em tarefas operacionais (</w:t>
             </w:r>
             <w:proofErr w:type="spellStart"/>
             <w:r>
@@ -1608,6 +1660,7 @@
               <w:rPr>
                 <w:lang w:val="pt-PT"/>
               </w:rPr>
+              <w:lastRenderedPageBreak/>
               <w:t>RF-BO-02</w:t>
             </w:r>
           </w:p>
@@ -1701,7 +1754,6 @@
               <w:rPr>
                 <w:lang w:val="pt-PT"/>
               </w:rPr>
-              <w:lastRenderedPageBreak/>
               <w:t>RF-BO-03</w:t>
             </w:r>
           </w:p>
@@ -3604,6 +3656,7 @@
               <w:rPr>
                 <w:lang w:val="pt-PT"/>
               </w:rPr>
+              <w:lastRenderedPageBreak/>
               <w:t>RF-BO-</w:t>
             </w:r>
           </w:p>
@@ -3743,7 +3796,6 @@
               <w:rPr>
                 <w:lang w:val="pt-PT"/>
               </w:rPr>
-              <w:lastRenderedPageBreak/>
               <w:t>RF-BO-</w:t>
             </w:r>
           </w:p>
@@ -5217,6 +5269,7 @@
               <w:rPr>
                 <w:lang w:val="pt-PT"/>
               </w:rPr>
+              <w:lastRenderedPageBreak/>
               <w:t>Critérios de Aceitação:</w:t>
             </w:r>
           </w:p>
@@ -5267,7 +5320,6 @@
               <w:rPr>
                 <w:lang w:val="pt-PT"/>
               </w:rPr>
-              <w:lastRenderedPageBreak/>
               <w:t>A lista deve estar em ordem cronológica.</w:t>
             </w:r>
           </w:p>
@@ -6337,6 +6389,7 @@
               <w:rPr>
                 <w:lang w:val="pt-PT"/>
               </w:rPr>
+              <w:lastRenderedPageBreak/>
               <w:t>A tarefa deve desaparecer da lista de "Pendentes".</w:t>
             </w:r>
           </w:p>
@@ -6500,7 +6553,6 @@
               <w:rPr>
                 <w:lang w:val="pt-PT"/>
               </w:rPr>
-              <w:lastRenderedPageBreak/>
               <w:t xml:space="preserve">Critérios de Aceitação: </w:t>
             </w:r>
           </w:p>

</xml_diff>